<commit_message>
docs: update pipeline management guide
</commit_message>
<xml_diff>
--- a/docs/Pulse_CRM_Руководство_пользователя.docx
+++ b/docs/Pulse_CRM_Руководство_пользователя.docx
@@ -82,7 +82,7 @@
           <w:color w:val="667085"/>
           <w:sz w:val="20"/>
         </w:rPr>
-        <w:t>Версия MVP 0.1  |  28 августа 2026</w:t>
+        <w:t>Версия MVP 0.1  |  29 августа 2026</w:t>
       </w:r>
     </w:p>
     <w:p>
@@ -2213,8 +2213,8 @@
       <w:r>
         <w:drawing>
           <wp:inline xmlns:a="http://schemas.openxmlformats.org/drawingml/2006/main" xmlns:pic="http://schemas.openxmlformats.org/drawingml/2006/picture">
-            <wp:extent cx="5806440" cy="3629024"/>
-            <wp:docPr id="13" name="Рисунок 13. Воронки и поля" title="Рисунок 13. Воронки и поля" descr="Настройки Pulse CRM с пользовательскими полями и этапами воронки"/>
+            <wp:extent cx="5486400" cy="3429000"/>
+            <wp:docPr id="13" name="Рисунок 13. Воронки и поля" title="Рисунок 13. Воронки и поля" descr="Управление воронкой и этапами в настройках Pulse CRM"/>
             <wp:cNvGraphicFramePr>
               <a:graphicFrameLocks noChangeAspect="1"/>
             </wp:cNvGraphicFramePr>
@@ -2234,7 +2234,7 @@
                   <pic:spPr>
                     <a:xfrm>
                       <a:off x="0" y="0"/>
-                      <a:ext cx="5806440" cy="3629024"/>
+                      <a:ext cx="5486400" cy="3429000"/>
                     </a:xfrm>
                     <a:prstGeom prst="rect"/>
                   </pic:spPr>
@@ -2267,7 +2267,71 @@
         <w:rPr>
           <w:rFonts w:ascii="Calibri" w:hAnsi="Calibri" w:eastAsia="Calibri" w:cs="Calibri"/>
         </w:rPr>
-        <w:t>«Новая воронка» создаёт готовый набор открытых и системных этапов.</w:t>
+        <w:t>«Новая воронка» создаёт рабочие и финальные этапы; название воронки должно быть уникальным.</w:t>
+      </w:r>
+    </w:p>
+    <w:p>
+      <w:pPr>
+        <w:pStyle w:val="GuideStep"/>
+        <w:numPr>
+          <w:ilvl w:val="0"/>
+          <w:numId w:val="10"/>
+        </w:numPr>
+        <w:spacing w:after="80" w:line="300" w:lineRule="auto"/>
+      </w:pPr>
+      <w:r>
+        <w:rPr>
+          <w:rFonts w:ascii="Calibri" w:hAnsi="Calibri" w:eastAsia="Calibri" w:cs="Calibri"/>
+        </w:rPr>
+        <w:t>Карандаш у воронки меняет название; «+» добавляет рабочий этап с названием и цветом перед финальными (до 50 этапов).</w:t>
+      </w:r>
+    </w:p>
+    <w:p>
+      <w:pPr>
+        <w:pStyle w:val="GuideStep"/>
+        <w:numPr>
+          <w:ilvl w:val="0"/>
+          <w:numId w:val="10"/>
+        </w:numPr>
+        <w:spacing w:after="80" w:line="300" w:lineRule="auto"/>
+      </w:pPr>
+      <w:r>
+        <w:rPr>
+          <w:rFonts w:ascii="Calibri" w:hAnsi="Calibri" w:eastAsia="Calibri" w:cs="Calibri"/>
+        </w:rPr>
+        <w:t>Карандаш этапа меняет название и цвет; корзина удаляет только неиспользуемый рабочий этап.</w:t>
+      </w:r>
+    </w:p>
+    <w:p>
+      <w:pPr>
+        <w:pStyle w:val="GuideStep"/>
+        <w:numPr>
+          <w:ilvl w:val="0"/>
+          <w:numId w:val="10"/>
+        </w:numPr>
+        <w:spacing w:after="80" w:line="300" w:lineRule="auto"/>
+      </w:pPr>
+      <w:r>
+        <w:rPr>
+          <w:rFonts w:ascii="Calibri" w:hAnsi="Calibri" w:eastAsia="Calibri" w:cs="Calibri"/>
+        </w:rPr>
+        <w:t>Финальные этапы можно переименовать, но нельзя удалить; в воронке должен остаться хотя бы один рабочий этап.</w:t>
+      </w:r>
+    </w:p>
+    <w:p>
+      <w:pPr>
+        <w:pStyle w:val="GuideStep"/>
+        <w:numPr>
+          <w:ilvl w:val="0"/>
+          <w:numId w:val="10"/>
+        </w:numPr>
+        <w:spacing w:after="80" w:line="300" w:lineRule="auto"/>
+      </w:pPr>
+      <w:r>
+        <w:rPr>
+          <w:rFonts w:ascii="Calibri" w:hAnsi="Calibri" w:eastAsia="Calibri" w:cs="Calibri"/>
+        </w:rPr>
+        <w:t>Корзина удаляет не последнюю активную воронку без сделок, истории переходов и связанных настроек.</w:t>
       </w:r>
     </w:p>
     <w:p>
@@ -2305,9 +2369,9 @@
     <w:p>
       <w:pPr>
         <w:pStyle w:val="GuideCallout"/>
-        <w:shd w:val="clear" w:color="auto" w:fill="F4F6F9"/>
+        <w:shd w:val="clear" w:color="auto" w:fill="FFF7ED"/>
         <w:pBdr>
-          <w:left w:val="single" w:sz="14" w:space="8" w:color="4F46E5"/>
+          <w:left w:val="single" w:sz="14" w:space="8" w:color="C2410C"/>
         </w:pBdr>
         <w:spacing w:before="140" w:after="140"/>
         <w:ind w:left="230" w:right="115"/>
@@ -2316,7 +2380,7 @@
         <w:rPr>
           <w:rFonts w:ascii="Calibri" w:hAnsi="Calibri" w:eastAsia="Calibri" w:cs="Calibri"/>
           <w:b/>
-          <w:color w:val="4F46E5"/>
+          <w:color w:val="C2410C"/>
         </w:rPr>
         <w:t xml:space="preserve">Важно: </w:t>
       </w:r>
@@ -2325,7 +2389,7 @@
           <w:rFonts w:ascii="Calibri" w:hAnsi="Calibri" w:eastAsia="Calibri" w:cs="Calibri"/>
           <w:color w:val="172033"/>
         </w:rPr>
-        <w:t>Входящий лид не теряется из-за незаполненных полей; ограничение срабатывает при следующей смене этапа.</w:t>
+        <w:t>Входящий лид не теряется из-за незаполненных полей. При отказе удаления устраните указанную зависимость. Если данные изменил другой администратор, повторите действие после обновления.</w:t>
       </w:r>
     </w:p>
     <w:p>
@@ -2360,7 +2424,7 @@
       <w:r>
         <w:drawing>
           <wp:inline xmlns:a="http://schemas.openxmlformats.org/drawingml/2006/main" xmlns:pic="http://schemas.openxmlformats.org/drawingml/2006/picture">
-            <wp:extent cx="4846320" cy="4543425"/>
+            <wp:extent cx="4846320" cy="3028949"/>
             <wp:docPr id="14" name="Рисунок 14. Редактор обязательных полей" title="Рисунок 14. Редактор обязательных полей" descr="Форма настройки обязательных полей этапа Предложение"/>
             <wp:cNvGraphicFramePr>
               <a:graphicFrameLocks noChangeAspect="1"/>
@@ -2381,7 +2445,7 @@
                   <pic:spPr>
                     <a:xfrm>
                       <a:off x="0" y="0"/>
-                      <a:ext cx="4846320" cy="4543425"/>
+                      <a:ext cx="4846320" cy="3028949"/>
                     </a:xfrm>
                     <a:prstGeom prst="rect"/>
                   </pic:spPr>
@@ -3303,6 +3367,58 @@
                 <w:sz w:val="19"/>
               </w:rPr>
               <w:t>Заполните перечисленные CRM обязательные поля и повторите действие.</w:t>
+            </w:r>
+          </w:p>
+        </w:tc>
+      </w:tr>
+      <w:tr>
+        <w:tc>
+          <w:tcPr>
+            <w:tcW w:type="dxa" w:w="2850"/>
+            <w:vAlign w:val="center"/>
+            <w:tcMar>
+              <w:top w:w="80" w:type="dxa"/>
+              <w:bottom w:w="80" w:type="dxa"/>
+              <w:start w:w="120" w:type="dxa"/>
+              <w:end w:w="120" w:type="dxa"/>
+            </w:tcMar>
+          </w:tcPr>
+          <w:p>
+            <w:pPr>
+              <w:spacing w:after="0" w:line="264" w:lineRule="auto"/>
+            </w:pPr>
+            <w:r>
+              <w:rPr>
+                <w:rFonts w:ascii="Calibri" w:hAnsi="Calibri" w:eastAsia="Calibri" w:cs="Calibri"/>
+                <w:color w:val="172033"/>
+                <w:sz w:val="19"/>
+              </w:rPr>
+              <w:t>Воронка или этап не удаляется</w:t>
+            </w:r>
+          </w:p>
+        </w:tc>
+        <w:tc>
+          <w:tcPr>
+            <w:tcW w:type="dxa" w:w="6510"/>
+            <w:vAlign w:val="center"/>
+            <w:tcMar>
+              <w:top w:w="80" w:type="dxa"/>
+              <w:bottom w:w="80" w:type="dxa"/>
+              <w:start w:w="120" w:type="dxa"/>
+              <w:end w:w="120" w:type="dxa"/>
+            </w:tcMar>
+          </w:tcPr>
+          <w:p>
+            <w:pPr>
+              <w:spacing w:after="0" w:line="264" w:lineRule="auto"/>
+            </w:pPr>
+            <w:r>
+              <w:rPr>
+                <w:rFonts w:ascii="Calibri" w:hAnsi="Calibri" w:eastAsia="Calibri" w:cs="Calibri"/>
+                <w:color w:val="172033"/>
+                <w:sz w:val="19"/>
+              </w:rPr>
+              <w:t>Объект используется сделками, историей или настройками. Перенесите данные и перенастройте указанную зависимость.</w:t>
             </w:r>
           </w:p>
         </w:tc>

</xml_diff>